<commit_message>
Update package dependencies, enhance evaluation results, and refine model outputs
</commit_message>
<xml_diff>
--- a/outputs/promotion_report.docx
+++ b/outputs/promotion_report.docx
@@ -10,8 +10,14 @@
         <w:t>Promotion Candidates Report</w:t>
       </w:r>
     </w:p>
+    <w:p>
+      <w:r>
+        <w:t>This report identifies 5 employees who are candidates for promotion based on their performance and tenure. Each individual has been with the company for more than 5 years and has maintained a high performance score of 4 or higher. These employees represent key talent across various departments and are recommended for further advancement.</w:t>
+      </w:r>
+    </w:p>
     <w:tbl>
       <w:tblPr>
+        <w:tblStyle w:val="TableGrid"/>
         <w:tblW w:type="auto" w:w="0"/>
         <w:tblLook w:firstColumn="1" w:firstRow="1" w:lastColumn="0" w:lastRow="0" w:noHBand="0" w:noVBand="1" w:val="04A0"/>
       </w:tblPr>
@@ -90,7 +96,7 @@
           </w:tcPr>
           <w:p>
             <w:r>
-              <w:t>80495</w:t>
+              <w:t>$80,495.00</w:t>
             </w:r>
           </w:p>
         </w:tc>
@@ -132,7 +138,7 @@
           </w:tcPr>
           <w:p>
             <w:r>
-              <w:t>123563</w:t>
+              <w:t>$123,563.00</w:t>
             </w:r>
           </w:p>
         </w:tc>
@@ -174,7 +180,7 @@
           </w:tcPr>
           <w:p>
             <w:r>
-              <w:t>78893</w:t>
+              <w:t>$78,893.00</w:t>
             </w:r>
           </w:p>
         </w:tc>
@@ -216,7 +222,7 @@
           </w:tcPr>
           <w:p>
             <w:r>
-              <w:t>50851</w:t>
+              <w:t>$50,851.00</w:t>
             </w:r>
           </w:p>
         </w:tc>
@@ -258,7 +264,7 @@
           </w:tcPr>
           <w:p>
             <w:r>
-              <w:t>63396</w:t>
+              <w:t>$63,396.00</w:t>
             </w:r>
           </w:p>
         </w:tc>
@@ -274,11 +280,6 @@
         </w:tc>
       </w:tr>
     </w:tbl>
-    <w:p>
-      <w:r>
-        <w:t>There are 5 employees eligible for promotion. They have been with the company for more than 5 years and have a performance score of 4 or higher. The department with the highest average performance score is Sales.</w:t>
-      </w:r>
-    </w:p>
     <w:sectPr>
       <w:pgSz w:w="12240" w:h="15840"/>
       <w:pgMar w:top="1440" w:right="1800" w:bottom="1440" w:left="1800" w:header="720" w:footer="720" w:gutter="0"/>

</xml_diff>